<commit_message>
Resume: Legal and Privacy Trainee @ Prudential plc (MNC)
</commit_message>
<xml_diff>
--- a/resumes/Resume_Legal_and_Privacy_Trainee_Prudential_plc__MNC_.docx
+++ b/resumes/Resume_Legal_and_Privacy_Trainee_Prudential_plc__MNC_.docx
@@ -430,7 +430,7 @@
           <w:sz w:val="19"/>
           <w:szCs w:val="19"/>
         </w:rPr>
-        <w:t>Triaged 50+ weekly inventory reimbursement cases by severity and policy eligibility, identifying high-priority issues for escalation.</w:t>
+        <w:t>Triaged 50+ weekly inventory reimbursement cases by severity and policy eligibility, following structured workflows.</w:t>
       </w:r>
     </w:p>
     <w:p>
@@ -449,7 +449,7 @@
           <w:sz w:val="19"/>
           <w:szCs w:val="19"/>
         </w:rPr>
-        <w:t>Investigated seller claims, analyzing root causes and policy violations to inform decision-making.</w:t>
+        <w:t>Investigated seller claims, identified policy violations and anomalous patterns, and escalated findings to senior reviewers.</w:t>
       </w:r>
     </w:p>
     <w:p>
@@ -468,7 +468,7 @@
           <w:sz w:val="19"/>
           <w:szCs w:val="19"/>
         </w:rPr>
-        <w:t>Maintained audit-ready case documentation with findings, decisions, evidence notes, and corrective actions aligned to evidence documentation and decision trails.</w:t>
+        <w:t>Analyzed 200+ weekly cases to spot recurring fraud patterns, reducing repeat-issue investigation time before escalation.</w:t>
       </w:r>
     </w:p>
     <w:p>
@@ -607,7 +607,7 @@
           <w:sz w:val="19"/>
           <w:szCs w:val="19"/>
         </w:rPr>
-        <w:t>Built automated SOAR (security orchestration and automation)-style detection pipeline: Python script ingests Splunk alerts, runs IOC enrichment (threat intelligence) via VirusTotal API, and dispatches Telegram notifications with severity classification using CVSS.</w:t>
+        <w:t>Built automated SOAR (security orchestration and automation)-style detection pipeline: Python script ingests Splunk alerts, runs IOC enrichment (threat intelligence) via VirusTotal API, and dispatches Telegram notifications with severity classification based on CVSS.</w:t>
       </w:r>
     </w:p>
     <w:p>
@@ -735,7 +735,7 @@
           <w:sz w:val="19"/>
           <w:szCs w:val="19"/>
         </w:rPr>
-        <w:t>Automated scan scheduling via Bash and cron; built delta-scan logic to flag newly discovered CVEs and organize patch compliance (remediation tracking) tracking evidence using NVD API.</w:t>
+        <w:t>Automated scan scheduling via Bash and cron; built delta-scan logic to flag newly discovered CVEs and organize patch compliance (remediation tracking) tracking evidence in a structured escalation workflow.</w:t>
       </w:r>
     </w:p>
     <w:p>

</xml_diff>